<commit_message>
Expand production scientist resume details
</commit_message>
<xml_diff>
--- a/Jeremy-Weter-Resume-2026.docx
+++ b/Jeremy-Weter-Resume-2026.docx
@@ -226,7 +226,7 @@
         </w:numPr>
       </w:pPr>
       <w:r>
-        <w:t>Initiate and support TrackWise quality system work, including deviations and change controls; trained on CAPAs and contribute to RCA writing and documentation to support investigations and corrective actions.</w:t>
+        <w:t>Support end-to-end batch manufacturing, filling, packaging, documentation, shipping support, and quality-system work in a cGMP, ISO 13485, and PSM-regulated production environment.</w:t>
       </w:r>
     </w:p>
     <w:p>
@@ -243,7 +243,7 @@
         </w:rPr>
       </w:pPr>
       <w:r>
-        <w:t>Perform manufacturing and packaging operations according to written protocols, ensuring compliance with cGMP and ISO 13485 quality standards.</w:t>
+        <w:t>Initiate and support TrackWise quality system work, including deviations and change controls; trained on CAPAs and contribute to RCA writing and documentation to support investigations and corrective actions.</w:t>
       </w:r>
     </w:p>
     <w:p>
@@ -260,7 +260,7 @@
         </w:rPr>
       </w:pPr>
       <w:r>
-        <w:t>Set up, operate, and clean manufacturing and packaging equipment to maintain operational efficiency and product quality.</w:t>
+        <w:t>Run material staging, weigh-ups, tank prewash/cleaning, stepwise additions, mix times/parameters, MPF/MMF record updates, kit documentation, and final overpack documentation.</w:t>
       </w:r>
     </w:p>
     <w:p>
@@ -273,7 +273,7 @@
         <w:spacing w:after="0"/>
       </w:pPr>
       <w:r>
-        <w:t>Run end-to-end batch manufacturing, including material staging, weigh-ups, tank prewash/cleaning, stepwise additions, and mix times/parameters documented in MMF records.</w:t>
+        <w:t>Set up, operate, and clean manufacturing and packaging equipment, including MasterFlex peristaltic filling, automatic capping, auto-labeling, and backordered batch filling support.</w:t>
       </w:r>
     </w:p>
     <w:p>
@@ -286,16 +286,12 @@
         <w:spacing w:after="0"/>
       </w:pPr>
       <w:r>
-        <w:t>Independently set up and operate a small filling/packaging line (</w:t>
+        <w:t>Maintain SOP, PPE, 5S, hazardous-material handling, and logbook expectations while writing/updating SOPs, printing production labels, and ensuring traceability from batch start through final overpack.</w:t>
       </w:r>
       <w:proofErr w:type="spellStart"/>
-      <w:r>
-        <w:t>MasterFlex</w:t>
-      </w:r>
+      <w:r/>
       <w:proofErr w:type="spellEnd"/>
-      <w:r>
-        <w:t xml:space="preserve"> peristaltic filling, automatic capper, auto-labeler), and packaging finished goods for shipment.</w:t>
-      </w:r>
+      <w:r/>
     </w:p>
     <w:p>
       <w:pPr>
@@ -307,7 +303,7 @@
         <w:spacing w:after="0"/>
       </w:pPr>
       <w:r>
-        <w:t>Execute manufacturing and packaging documentation with high attention to detail, ensuring traceability and cGMP alignment from batch start through final overpack.</w:t>
+        <w:t>Support SAP inventory transactions, including TECO completion, while assisting with equipment maintenance, reagent preparation, restocking supplies, and waste disposal.</w:t>
       </w:r>
     </w:p>
     <w:p>
@@ -324,8 +320,7 @@
         </w:rPr>
       </w:pPr>
       <w:r>
-        <w:lastRenderedPageBreak/>
-        <w:t>Conduct and interpret analytical evaluations of products, intermediates, and cleaning samples to support quality assurance.</w:t>
+        <w:t>Assist with shipping and palletizing when backlogs require support, including weekend overtime to assemble and ship high-value kit backorders.</w:t>
       </w:r>
     </w:p>
     <w:p>
@@ -342,7 +337,7 @@
         </w:rPr>
       </w:pPr>
       <w:r>
-        <w:t xml:space="preserve"> Accurately complete all required documentation and log-books consistent with quality guidelines.</w:t>
+        <w:t>Conduct and interpret analytical evaluations of products, intermediates, and cleaning samples to support quality assurance.</w:t>
       </w:r>
     </w:p>
     <w:p>
@@ -359,7 +354,7 @@
         </w:rPr>
       </w:pPr>
       <w:r>
-        <w:t>Support facility and departmental operations, including equipment maintenance, reagent preparation, restocking supplies, and waste disposal.</w:t>
+        <w:t>Build dashboards and trend summaries (e.g., supply gaps, backorders, operational holds) to surface recurring bottlenecks and action owners.</w:t>
       </w:r>
     </w:p>
     <w:p>
@@ -376,63 +371,10 @@
         </w:rPr>
       </w:pPr>
       <w:r>
-        <w:t xml:space="preserve">Initiate and investigate </w:t>
-      </w:r>
-      <w:r>
-        <w:t>deviations and</w:t>
-      </w:r>
-      <w:r>
-        <w:t xml:space="preserve"> participate in change control processes to drive continuous improvement.</w:t>
-      </w:r>
-    </w:p>
-    <w:p>
-      <w:pPr>
-        <w:pStyle w:val="ListParagraph"/>
-        <w:numPr>
-          <w:ilvl w:val="0"/>
-          <w:numId w:val="14"/>
-        </w:numPr>
-        <w:spacing w:after="0"/>
-        <w:rPr>
-          <w:b/>
-          <w:bCs/>
-        </w:rPr>
-      </w:pPr>
-      <w:r>
-        <w:t>Collaborate with cross-functional teams and external customers to resolve operational challenges.</w:t>
-      </w:r>
-    </w:p>
-    <w:p>
-      <w:pPr>
-        <w:pStyle w:val="ListParagraph"/>
-        <w:numPr>
-          <w:ilvl w:val="0"/>
-          <w:numId w:val="14"/>
-        </w:numPr>
-        <w:spacing w:after="0"/>
-      </w:pPr>
-      <w:r>
-        <w:t>Build dashboards and trend summaries (e.g., supply gaps, backorders, operational holds) to surface recurring bottlenecks and action owners.</w:t>
-      </w:r>
-    </w:p>
-    <w:p>
-      <w:pPr>
-        <w:pStyle w:val="ListParagraph"/>
-        <w:numPr>
-          <w:ilvl w:val="0"/>
-          <w:numId w:val="15"/>
-        </w:numPr>
-        <w:spacing w:after="0"/>
-      </w:pPr>
-      <w:r>
         <w:t>Prototype AI-assisted SOP/workflow support in Merck GPT to help standardize label-printing steps, reduce errors, and improve onboarding coverage.</w:t>
       </w:r>
-    </w:p>
-    <w:p>
-      <w:pPr>
-        <w:pStyle w:val="ListParagraph"/>
-        <w:spacing w:after="0"/>
-      </w:pPr>
+      <w:r/>
+      <w:r/>
     </w:p>
     <w:p>
       <w:pPr>

</xml_diff>

<commit_message>
Add AI and data integrity production work
</commit_message>
<xml_diff>
--- a/Jeremy-Weter-Resume-2026.docx
+++ b/Jeremy-Weter-Resume-2026.docx
@@ -337,7 +337,7 @@
         </w:rPr>
       </w:pPr>
       <w:r>
-        <w:t>Conduct and interpret analytical evaluations of products, intermediates, and cleaning samples to support quality assurance.</w:t>
+        <w:t>Serve as the H&amp;H location Data Integrity SME, participate in weekly CAPA meetings, and build TrackWise bottleneck dashboards and trend summaries for supply gaps, backorders, and operational holds.</w:t>
       </w:r>
     </w:p>
     <w:p>
@@ -354,7 +354,15 @@
         </w:rPr>
       </w:pPr>
       <w:r>
-        <w:t>Build dashboards and trend summaries (e.g., supply gaps, backorders, operational holds) to surface recurring bottlenecks and action owners.</w:t>
+        <w:t>Contribute to Merck global AI development community work while prototyping AI-assisted SOP/workflow support in Merck GPT to standardize label-printing steps, reduce errors, and improve onboarding coverage.</w:t>
+      </w:r>
+    </w:p>
+    <w:p>
+      <w:pPr>
+        <w:pStyle w:val="ListParagraph"/>
+      </w:pPr>
+      <w:r>
+        <w:t>Support TrackWise onboarding and decommissioning projects; scheduled to begin internal Blue Belt training after holiday.</w:t>
       </w:r>
     </w:p>
     <w:p>
@@ -371,7 +379,7 @@
         </w:rPr>
       </w:pPr>
       <w:r>
-        <w:t>Prototype AI-assisted SOP/workflow support in Merck GPT to help standardize label-printing steps, reduce errors, and improve onboarding coverage.</w:t>
+        <w:t>Conduct and interpret analytical evaluations of products, intermediates, and cleaning samples to support quality assurance.</w:t>
       </w:r>
       <w:r/>
       <w:r/>

</xml_diff>